<commit_message>
fix(mau-12): tách dấu chấm câu khỏi chỗ điền quý (bản xuất mất dấu chấm); danh mục biểu mẫu Word theo thứ tự số mẫu
</commit_message>
<xml_diff>
--- a/backend/src/CongTacDang.Infrastructure/Templates/Word/Mau_12_BienBanHoiNghi.docx
+++ b/backend/src/CongTacDang.Infrastructure/Templates/Word/Mau_12_BienBanHoiNghi.docx
@@ -511,7 +511,7 @@
               <w:szCs w:val="28"/>
               <w:lang w:val="vi-VN"/>
             </w:rPr>
-            <w:t xml:space="preserve">....</w:t>
+            <w:t xml:space="preserve">...</w:t>
           </w:r>
         </w:sdtContent>
       </w:sdt>
@@ -521,7 +521,7 @@
           <w:szCs w:val="28"/>
           <w:lang w:val="vi-VN"/>
         </w:rPr>
-        <w:t xml:space="preserve"> Cụ thể như sau:</w:t>
+        <w:t xml:space="preserve">. Cụ thể như sau:</w:t>
       </w:r>
     </w:p>
     <w:p>

</xml_diff>

<commit_message>
fix(bien-ban): Mẫu 12, 13 in gọn đúng khổ — tiêu đề Đảng bộ không tràn lề, chữ ký thẳng hàng không tách trang, tiêu đề Mẫu 13 màu đen, bảng kết quả không giãn chữ; dòng xuống dòng trong nội dung không bị giãn; giờ họp nhập theo giờ Việt Nam
</commit_message>
<xml_diff>
--- a/backend/src/CongTacDang.Infrastructure/Templates/Word/Mau_12_BienBanHoiNghi.docx
+++ b/backend/src/CongTacDang.Infrastructure/Templates/Word/Mau_12_BienBanHoiNghi.docx
@@ -36,18 +36,18 @@
     </w:p>
     <w:tbl>
       <w:tblPr>
-        <w:tblW w:w="8789" w:type="dxa"/>
-        <w:tblInd w:w="1701" w:type="dxa"/>
+        <w:tblW w:w="10204" w:type="dxa"/>
+        <w:tblLayout w:type="fixed"/>
         <w:tblLook w:val="01E0" w:firstRow="1" w:lastRow="1" w:firstColumn="1" w:lastColumn="1" w:noHBand="0" w:noVBand="0"/>
       </w:tblPr>
       <w:tblGrid>
-        <w:gridCol w:w="3261"/>
-        <w:gridCol w:w="5528"/>
+        <w:gridCol w:w="5216"/>
+        <w:gridCol w:w="4988"/>
       </w:tblGrid>
       <w:tr>
         <w:tc>
           <w:tcPr>
-            <w:tcW w:w="3261" w:type="dxa"/>
+            <w:tcW w:w="5216" w:type="dxa"/>
           </w:tcPr>
           <w:p>
             <w:pPr>
@@ -70,7 +70,6 @@
           <w:p>
             <w:pPr>
               <w:spacing w:after="0" w:line="240" w:lineRule="auto"/>
-              <w:ind w:firstLine="38"/>
               <w:jc w:val="center"/>
               <w:rPr>
                 <w:b/>
@@ -95,7 +94,6 @@
           <w:p>
             <w:pPr>
               <w:spacing w:after="0" w:line="240" w:lineRule="auto"/>
-              <w:ind w:firstLine="709"/>
               <w:jc w:val="center"/>
             </w:pPr>
             <w:r>
@@ -105,12 +103,11 @@
         </w:tc>
         <w:tc>
           <w:tcPr>
-            <w:tcW w:w="5528" w:type="dxa"/>
+            <w:tcW w:w="4988" w:type="dxa"/>
           </w:tcPr>
           <w:p>
             <w:pPr>
               <w:spacing w:after="0" w:line="240" w:lineRule="auto"/>
-              <w:ind w:hanging="113"/>
               <w:jc w:val="center"/>
               <w:rPr>
                 <w:b/>
@@ -130,7 +127,6 @@
           <w:p>
             <w:pPr>
               <w:spacing w:after="0" w:line="240" w:lineRule="auto"/>
-              <w:ind w:firstLine="709"/>
               <w:jc w:val="center"/>
               <w:rPr>
                 <w:lang w:val="en-US"/>
@@ -212,7 +208,6 @@
           <w:p>
             <w:pPr>
               <w:spacing w:after="0" w:line="240" w:lineRule="auto"/>
-              <w:ind w:firstLine="709"/>
               <w:jc w:val="right"/>
               <w:rPr>
                 <w:i/>
@@ -1350,6 +1345,7 @@
     </w:sdt>
     <w:p>
       <w:pPr>
+        <w:keepNext/>
         <w:spacing w:before="120"/>
         <w:ind w:firstLine="706"/>
         <w:rPr>
@@ -1450,23 +1446,26 @@
     </w:p>
     <w:tbl>
       <w:tblPr>
-        <w:tblW w:w="0" w:type="auto"/>
-        <w:tblInd w:w="-252" w:type="dxa"/>
+        <w:tblW w:w="10204" w:type="dxa"/>
+        <w:tblLayout w:type="fixed"/>
         <w:tblLook w:val="01E0" w:firstRow="1" w:lastRow="1" w:firstColumn="1" w:lastColumn="1" w:noHBand="0" w:noVBand="0"/>
       </w:tblPr>
       <w:tblGrid>
-        <w:gridCol w:w="3762"/>
-        <w:gridCol w:w="810"/>
-        <w:gridCol w:w="3553"/>
+        <w:gridCol w:w="4600"/>
+        <w:gridCol w:w="1004"/>
+        <w:gridCol w:w="4600"/>
       </w:tblGrid>
       <w:tr>
+        <w:trPr>
+          <w:cantSplit/>
+        </w:trPr>
         <w:tc>
           <w:tcPr>
-            <w:tcW w:w="3762" w:type="dxa"/>
+            <w:tcW w:w="4600" w:type="dxa"/>
           </w:tcPr>
           <w:p>
             <w:pPr>
-              <w:ind w:firstLine="709"/>
+              <w:keepNext/>
               <w:jc w:val="center"/>
               <w:rPr>
                 <w:b/>
@@ -1485,7 +1484,7 @@
           </w:p>
           <w:p>
             <w:pPr>
-              <w:ind w:firstLine="709"/>
+              <w:keepNext/>
               <w:jc w:val="center"/>
               <w:rPr>
                 <w:b/>
@@ -1504,9 +1503,24 @@
               <w:t>(ký, ghi rõ họ tên)</w:t>
             </w:r>
           </w:p>
+        </w:tc>
+        <w:tc>
+          <w:tcPr>
+            <w:tcW w:w="1004" w:type="dxa"/>
+          </w:tcPr>
           <w:p>
             <w:pPr>
-              <w:ind w:firstLine="709"/>
+              <w:keepNext/>
+            </w:pPr>
+          </w:p>
+        </w:tc>
+        <w:tc>
+          <w:tcPr>
+            <w:tcW w:w="4600" w:type="dxa"/>
+          </w:tcPr>
+          <w:p>
+            <w:pPr>
+              <w:keepNext/>
               <w:jc w:val="center"/>
               <w:rPr>
                 <w:b/>
@@ -1514,62 +1528,83 @@
                 <w:szCs w:val="28"/>
               </w:rPr>
             </w:pPr>
-          </w:p>
-          <w:p>
-            <w:pPr>
-              <w:ind w:firstLine="709"/>
-              <w:jc w:val="center"/>
+            <w:r>
               <w:rPr>
                 <w:b/>
                 <w:sz w:val="28"/>
                 <w:szCs w:val="28"/>
               </w:rPr>
-            </w:pPr>
+              <w:t>CHỦ TRÌ HỘI NGHỊ</w:t>
+            </w:r>
           </w:p>
           <w:p>
             <w:pPr>
-              <w:ind w:firstLine="709"/>
+              <w:keepNext/>
               <w:jc w:val="center"/>
               <w:rPr>
-                <w:b/>
                 <w:sz w:val="28"/>
                 <w:szCs w:val="28"/>
               </w:rPr>
             </w:pPr>
+            <w:sdt>
+              <w:sdtPr>
+                <w:alias w:val="CHAIR_SIGN_TITLE"/>
+                <w:tag w:val="CHAIR_SIGN_TITLE"/>
+                <w:id w:val="900069"/>
+              </w:sdtPr>
+              <w:sdtContent>
+                <w:r>
+                  <w:rPr>
+                    <w:sz w:val="28"/>
+                    <w:szCs w:val="28"/>
+                  </w:rPr>
+                  <w:t xml:space="preserve">BÍ THƯ</w:t>
+                </w:r>
+              </w:sdtContent>
+            </w:sdt>
           </w:p>
           <w:p>
             <w:pPr>
-              <w:ind w:firstLine="709"/>
+              <w:keepNext/>
               <w:jc w:val="center"/>
               <w:rPr>
-                <w:b/>
                 <w:sz w:val="28"/>
                 <w:szCs w:val="28"/>
               </w:rPr>
             </w:pPr>
+            <w:sdt>
+              <w:sdtPr>
+                <w:alias w:val="CHAIR_SIGN_NOTE"/>
+                <w:tag w:val="CHAIR_SIGN_NOTE"/>
+                <w:id w:val="900070"/>
+              </w:sdtPr>
+              <w:sdtContent>
+                <w:r>
+                  <w:rPr>
+                    <w:bCs/>
+                    <w:i/>
+                    <w:iCs/>
+                    <w:sz w:val="20"/>
+                    <w:szCs w:val="20"/>
+                  </w:rPr>
+                  <w:t xml:space="preserve">(ký, ghi rõ họ tên, đóng dấu)</w:t>
+                </w:r>
+              </w:sdtContent>
+            </w:sdt>
           </w:p>
+        </w:tc>
+      </w:tr>
+      <w:tr>
+        <w:trPr>
+          <w:cantSplit/>
+        </w:trPr>
+        <w:tc>
+          <w:tcPr>
+            <w:tcW w:w="4600" w:type="dxa"/>
+          </w:tcPr>
           <w:p>
             <w:pPr>
-              <w:rPr>
-                <w:b/>
-                <w:sz w:val="28"/>
-                <w:szCs w:val="28"/>
-              </w:rPr>
-            </w:pPr>
-          </w:p>
-          <w:p>
-            <w:pPr>
-              <w:ind w:firstLine="709"/>
-              <w:rPr>
-                <w:b/>
-                <w:sz w:val="28"/>
-                <w:szCs w:val="28"/>
-              </w:rPr>
-            </w:pPr>
-          </w:p>
-          <w:p>
-            <w:pPr>
-              <w:ind w:firstLine="709"/>
+              <w:spacing w:before="1080" w:after="0"/>
               <w:jc w:val="center"/>
               <w:rPr>
                 <w:b/>
@@ -1597,222 +1632,17 @@
         </w:tc>
         <w:tc>
           <w:tcPr>
-            <w:tcW w:w="810" w:type="dxa"/>
+            <w:tcW w:w="1004" w:type="dxa"/>
+          </w:tcPr>
+          <w:p/>
+        </w:tc>
+        <w:tc>
+          <w:tcPr>
+            <w:tcW w:w="4600" w:type="dxa"/>
           </w:tcPr>
           <w:p>
             <w:pPr>
-              <w:ind w:firstLine="709"/>
-              <w:jc w:val="center"/>
-              <w:rPr>
-                <w:b/>
-                <w:sz w:val="28"/>
-                <w:szCs w:val="28"/>
-              </w:rPr>
-            </w:pPr>
-          </w:p>
-        </w:tc>
-        <w:tc>
-          <w:tcPr>
-            <w:tcW w:w="3553" w:type="dxa"/>
-          </w:tcPr>
-          <w:p>
-            <w:pPr>
-              <w:ind w:firstLine="709"/>
-              <w:jc w:val="center"/>
-              <w:rPr>
-                <w:b/>
-                <w:sz w:val="28"/>
-                <w:szCs w:val="28"/>
-              </w:rPr>
-            </w:pPr>
-            <w:r>
-              <w:rPr>
-                <w:b/>
-                <w:sz w:val="28"/>
-                <w:szCs w:val="28"/>
-              </w:rPr>
-              <w:t>CHỦ TRÌ HỘI NGHỊ</w:t>
-            </w:r>
-          </w:p>
-          <w:p>
-            <w:pPr>
-              <w:ind w:firstLine="709"/>
-              <w:jc w:val="center"/>
-              <w:rPr>
-                <w:sz w:val="28"/>
-                <w:szCs w:val="28"/>
-              </w:rPr>
-            </w:pPr>
-            <w:sdt>
-              <w:sdtPr>
-                <w:alias w:val="CHAIR_SIGN_TITLE"/>
-                <w:tag w:val="CHAIR_SIGN_TITLE"/>
-                <w:id w:val="900069"/>
-              </w:sdtPr>
-              <w:sdtContent>
-                <w:r>
-                  <w:rPr>
-                    <w:sz w:val="28"/>
-                    <w:szCs w:val="28"/>
-                  </w:rPr>
-                  <w:t xml:space="preserve">BÍ THƯ</w:t>
-                </w:r>
-              </w:sdtContent>
-            </w:sdt>
-          </w:p>
-          <w:p>
-            <w:pPr>
-              <w:ind w:firstLine="709"/>
-              <w:jc w:val="center"/>
-              <w:rPr>
-                <w:sz w:val="28"/>
-                <w:szCs w:val="28"/>
-              </w:rPr>
-            </w:pPr>
-            <w:sdt>
-              <w:sdtPr>
-                <w:alias w:val="CHAIR_SIGN_NOTE"/>
-                <w:tag w:val="CHAIR_SIGN_NOTE"/>
-                <w:id w:val="900070"/>
-              </w:sdtPr>
-              <w:sdtContent>
-                <w:r>
-                  <w:rPr>
-                    <w:bCs/>
-                    <w:i/>
-                    <w:iCs/>
-                    <w:sz w:val="20"/>
-                    <w:szCs w:val="20"/>
-                  </w:rPr>
-                  <w:t xml:space="preserve">(ký, ghi rõ họ tên, đóng dấu)</w:t>
-                </w:r>
-              </w:sdtContent>
-            </w:sdt>
-          </w:p>
-          <w:p>
-            <w:pPr>
-              <w:ind w:firstLine="709"/>
-              <w:jc w:val="center"/>
-              <w:rPr>
-                <w:sz w:val="28"/>
-                <w:szCs w:val="28"/>
-              </w:rPr>
-            </w:pPr>
-          </w:p>
-          <w:p>
-            <w:pPr>
-              <w:rPr>
-                <w:sz w:val="28"/>
-                <w:szCs w:val="28"/>
-              </w:rPr>
-            </w:pPr>
-          </w:p>
-          <w:p>
-            <w:pPr>
-              <w:rPr>
-                <w:sz w:val="28"/>
-                <w:szCs w:val="28"/>
-              </w:rPr>
-            </w:pPr>
-          </w:p>
-          <w:p>
-            <w:pPr>
-              <w:ind w:firstLine="709"/>
-              <w:rPr>
-                <w:sz w:val="28"/>
-                <w:szCs w:val="28"/>
-              </w:rPr>
-            </w:pPr>
-          </w:p>
-          <w:p>
-            <w:pPr>
-              <w:ind w:firstLine="709"/>
-              <w:rPr>
-                <w:sz w:val="28"/>
-                <w:szCs w:val="28"/>
-              </w:rPr>
-            </w:pPr>
-          </w:p>
-          <w:p>
-            <w:pPr>
-              <w:ind w:firstLine="709"/>
-              <w:rPr>
-                <w:sz w:val="28"/>
-                <w:szCs w:val="28"/>
-              </w:rPr>
-            </w:pPr>
-          </w:p>
-          <w:p>
-            <w:pPr>
-              <w:ind w:firstLine="709"/>
-              <w:rPr>
-                <w:sz w:val="28"/>
-                <w:szCs w:val="28"/>
-              </w:rPr>
-            </w:pPr>
-          </w:p>
-          <w:p>
-            <w:pPr>
-              <w:ind w:firstLine="709"/>
-              <w:rPr>
-                <w:sz w:val="28"/>
-                <w:szCs w:val="28"/>
-              </w:rPr>
-            </w:pPr>
-          </w:p>
-          <w:p>
-            <w:pPr>
-              <w:rPr>
-                <w:b/>
-                <w:sz w:val="28"/>
-                <w:szCs w:val="28"/>
-                <w:lang w:val="en-US"/>
-              </w:rPr>
-            </w:pPr>
-          </w:p>
-          <w:p>
-            <w:pPr>
-              <w:rPr>
-                <w:b/>
-                <w:sz w:val="28"/>
-                <w:szCs w:val="28"/>
-                <w:lang w:val="en-US"/>
-              </w:rPr>
-            </w:pPr>
-          </w:p>
-          <w:p>
-            <w:pPr>
-              <w:rPr>
-                <w:b/>
-                <w:sz w:val="28"/>
-                <w:szCs w:val="28"/>
-                <w:lang w:val="en-US"/>
-              </w:rPr>
-            </w:pPr>
-          </w:p>
-          <w:p>
-            <w:pPr>
-              <w:rPr>
-                <w:b/>
-                <w:sz w:val="28"/>
-                <w:szCs w:val="28"/>
-                <w:lang w:val="en-US"/>
-              </w:rPr>
-            </w:pPr>
-          </w:p>
-          <w:p>
-            <w:pPr>
-              <w:rPr>
-                <w:b/>
-                <w:sz w:val="28"/>
-                <w:szCs w:val="28"/>
-                <w:lang w:val="en-US"/>
-              </w:rPr>
-            </w:pPr>
-          </w:p>
-          <w:p>
-            <w:pPr>
-              <w:ind w:firstLine="709"/>
+              <w:spacing w:before="1080" w:after="0"/>
               <w:jc w:val="center"/>
               <w:rPr>
                 <w:b/>

</xml_diff>